<commit_message>
Adiciona novo jogo e atualiza documentação
</commit_message>
<xml_diff>
--- a/Diario/diario.DOCX
+++ b/Diario/diario.DOCX
@@ -75,7 +75,7 @@
               </wp:anchor>
             </w:drawing>
           </mc:Choice>
-          <mc:Fallback xmlns:oel="http://schemas.microsoft.com/office/2019/extlst" xmlns:w16cex="http://schemas.microsoft.com/office/word/2018/wordml/cex" xmlns:w16="http://schemas.microsoft.com/office/word/2018/wordml" xmlns:w16du="http://schemas.microsoft.com/office/word/2023/wordml/word16du" xmlns:w16sdtdh="http://schemas.microsoft.com/office/word/2020/wordml/sdtdatahash" xmlns:w16sdtfl="http://schemas.microsoft.com/office/word/2024/wordml/sdtformatlock">
+          <mc:Fallback xmlns:w16sdtfl="http://schemas.microsoft.com/office/word/2024/wordml/sdtformatlock" xmlns:w16sdtdh="http://schemas.microsoft.com/office/word/2020/wordml/sdtdatahash" xmlns:w16du="http://schemas.microsoft.com/office/word/2023/wordml/word16du" xmlns:w16="http://schemas.microsoft.com/office/word/2018/wordml" xmlns:w16cex="http://schemas.microsoft.com/office/word/2018/wordml/cex" xmlns:oel="http://schemas.microsoft.com/office/2019/extlst">
             <w:pict>
               <v:rect w14:anchorId="40606E68" id="Retângulo 1" o:spid="_x0000_s1026" style="position:absolute;margin-left:0;margin-top:-84.35pt;width:594.5pt;height:153.5pt;z-index:-251657216;visibility:visible;mso-wrap-style:square;mso-height-percent:0;mso-wrap-distance-left:9pt;mso-wrap-distance-top:0;mso-wrap-distance-right:9pt;mso-wrap-distance-bottom:0;mso-position-horizontal:left;mso-position-horizontal-relative:page;mso-position-vertical:absolute;mso-position-vertical-relative:text;mso-height-percent:0;mso-height-relative:margin;v-text-anchor:middle" o:gfxdata="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" fillcolor="#f2f2f2" strokecolor="#f2f2f2" strokeweight="1pt">
                 <w10:wrap anchorx="page"/>
@@ -1695,19 +1695,7 @@
         <w:rPr>
           <w:rFonts w:ascii="Arial" w:hAnsi="Arial" w:cs="Arial"/>
         </w:rPr>
-        <w:t>Camila:1</w:t>
-      </w:r>
-      <w:r>
-        <w:rPr>
-          <w:rFonts w:ascii="Arial" w:hAnsi="Arial" w:cs="Arial"/>
-        </w:rPr>
-        <w:t>1</w:t>
-      </w:r>
-      <w:r>
-        <w:rPr>
-          <w:rFonts w:ascii="Arial" w:hAnsi="Arial" w:cs="Arial"/>
-        </w:rPr>
-        <w:t xml:space="preserve"> horas</w:t>
+        <w:t>Camila:11 horas</w:t>
       </w:r>
       <w:r>
         <w:rPr>
@@ -1730,19 +1718,7 @@
         <w:rPr>
           <w:rFonts w:ascii="Arial" w:hAnsi="Arial" w:cs="Arial"/>
         </w:rPr>
-        <w:t>Daniel: 1</w:t>
-      </w:r>
-      <w:r>
-        <w:rPr>
-          <w:rFonts w:ascii="Arial" w:hAnsi="Arial" w:cs="Arial"/>
-        </w:rPr>
-        <w:t>1</w:t>
-      </w:r>
-      <w:r>
-        <w:rPr>
-          <w:rFonts w:ascii="Arial" w:hAnsi="Arial" w:cs="Arial"/>
-        </w:rPr>
-        <w:t xml:space="preserve"> horas</w:t>
+        <w:t>Daniel: 11 horas</w:t>
       </w:r>
     </w:p>
     <w:p>
@@ -1759,19 +1735,7 @@
         <w:rPr>
           <w:rFonts w:ascii="Arial" w:hAnsi="Arial" w:cs="Arial"/>
         </w:rPr>
-        <w:t>Diana:1</w:t>
-      </w:r>
-      <w:r>
-        <w:rPr>
-          <w:rFonts w:ascii="Arial" w:hAnsi="Arial" w:cs="Arial"/>
-        </w:rPr>
-        <w:t>1</w:t>
-      </w:r>
-      <w:r>
-        <w:rPr>
-          <w:rFonts w:ascii="Arial" w:hAnsi="Arial" w:cs="Arial"/>
-        </w:rPr>
-        <w:t xml:space="preserve"> horas</w:t>
+        <w:t>Diana:11 horas</w:t>
       </w:r>
     </w:p>
     <w:p>
@@ -1788,19 +1752,7 @@
         <w:rPr>
           <w:rFonts w:ascii="Arial" w:hAnsi="Arial" w:cs="Arial"/>
         </w:rPr>
-        <w:t>Felipe:1</w:t>
-      </w:r>
-      <w:r>
-        <w:rPr>
-          <w:rFonts w:ascii="Arial" w:hAnsi="Arial" w:cs="Arial"/>
-        </w:rPr>
-        <w:t>1</w:t>
-      </w:r>
-      <w:r>
-        <w:rPr>
-          <w:rFonts w:ascii="Arial" w:hAnsi="Arial" w:cs="Arial"/>
-        </w:rPr>
-        <w:t xml:space="preserve"> horas</w:t>
+        <w:t>Felipe:11 horas</w:t>
       </w:r>
     </w:p>
     <w:p>
@@ -1817,19 +1769,7 @@
         <w:rPr>
           <w:rFonts w:ascii="Arial" w:hAnsi="Arial" w:cs="Arial"/>
         </w:rPr>
-        <w:t>Francisco: 1</w:t>
-      </w:r>
-      <w:r>
-        <w:rPr>
-          <w:rFonts w:ascii="Arial" w:hAnsi="Arial" w:cs="Arial"/>
-        </w:rPr>
-        <w:t>1</w:t>
-      </w:r>
-      <w:r>
-        <w:rPr>
-          <w:rFonts w:ascii="Arial" w:hAnsi="Arial" w:cs="Arial"/>
-        </w:rPr>
-        <w:t xml:space="preserve"> horas</w:t>
+        <w:t>Francisco: 11 horas</w:t>
       </w:r>
     </w:p>
     <w:p>
@@ -1846,19 +1786,7 @@
         <w:rPr>
           <w:rFonts w:ascii="Arial" w:hAnsi="Arial" w:cs="Arial"/>
         </w:rPr>
-        <w:t>Luan:1</w:t>
-      </w:r>
-      <w:r>
-        <w:rPr>
-          <w:rFonts w:ascii="Arial" w:hAnsi="Arial" w:cs="Arial"/>
-        </w:rPr>
-        <w:t>1</w:t>
-      </w:r>
-      <w:r>
-        <w:rPr>
-          <w:rFonts w:ascii="Arial" w:hAnsi="Arial" w:cs="Arial"/>
-        </w:rPr>
-        <w:t xml:space="preserve"> horas</w:t>
+        <w:t>Luan:11 horas</w:t>
       </w:r>
     </w:p>
     <w:p>
@@ -1876,19 +1804,7 @@
           <w:rFonts w:ascii="Arial" w:hAnsi="Arial" w:cs="Arial"/>
         </w:rPr>
         <w:lastRenderedPageBreak/>
-        <w:t>Jonatas:1</w:t>
-      </w:r>
-      <w:r>
-        <w:rPr>
-          <w:rFonts w:ascii="Arial" w:hAnsi="Arial" w:cs="Arial"/>
-        </w:rPr>
-        <w:t>1</w:t>
-      </w:r>
-      <w:r>
-        <w:rPr>
-          <w:rFonts w:ascii="Arial" w:hAnsi="Arial" w:cs="Arial"/>
-        </w:rPr>
-        <w:t xml:space="preserve"> horas</w:t>
+        <w:t>Jonatas:11 horas</w:t>
       </w:r>
     </w:p>
     <w:p>
@@ -1905,19 +1821,7 @@
         <w:rPr>
           <w:rFonts w:ascii="Arial" w:hAnsi="Arial" w:cs="Arial"/>
         </w:rPr>
-        <w:t>Miguel: 1</w:t>
-      </w:r>
-      <w:r>
-        <w:rPr>
-          <w:rFonts w:ascii="Arial" w:hAnsi="Arial" w:cs="Arial"/>
-        </w:rPr>
-        <w:t>1</w:t>
-      </w:r>
-      <w:r>
-        <w:rPr>
-          <w:rFonts w:ascii="Arial" w:hAnsi="Arial" w:cs="Arial"/>
-        </w:rPr>
-        <w:t xml:space="preserve"> horas</w:t>
+        <w:t>Miguel: 11 horas</w:t>
       </w:r>
     </w:p>
     <w:p>
@@ -1963,8 +1867,6 @@
         </w:rPr>
         <w:t>Março</w:t>
       </w:r>
-      <w:bookmarkStart w:id="0" w:name="_GoBack"/>
-      <w:bookmarkEnd w:id="0"/>
     </w:p>
     <w:tbl>
       <w:tblPr>
@@ -2986,19 +2888,7 @@
               <w:rPr>
                 <w:rFonts w:ascii="Arial" w:hAnsi="Arial" w:cs="Arial"/>
               </w:rPr>
-              <w:t xml:space="preserve">Francisco, Luan, Miguel </w:t>
-            </w:r>
-            <w:r>
-              <w:rPr>
-                <w:rFonts w:ascii="Arial" w:hAnsi="Arial" w:cs="Arial"/>
-              </w:rPr>
-              <w:t xml:space="preserve">e </w:t>
-            </w:r>
-            <w:r>
-              <w:rPr>
-                <w:rFonts w:ascii="Arial" w:hAnsi="Arial" w:cs="Arial"/>
-              </w:rPr>
-              <w:t>Jonatas,</w:t>
+              <w:t>Francisco, Luan, Miguel e Jonatas,</w:t>
             </w:r>
           </w:p>
         </w:tc>
@@ -3114,19 +3004,7 @@
               <w:rPr>
                 <w:rFonts w:ascii="Arial" w:hAnsi="Arial" w:cs="Arial"/>
               </w:rPr>
-              <w:t xml:space="preserve">Francisco, Luan, Miguel </w:t>
-            </w:r>
-            <w:r>
-              <w:rPr>
-                <w:rFonts w:ascii="Arial" w:hAnsi="Arial" w:cs="Arial"/>
-              </w:rPr>
-              <w:t xml:space="preserve">e </w:t>
-            </w:r>
-            <w:r>
-              <w:rPr>
-                <w:rFonts w:ascii="Arial" w:hAnsi="Arial" w:cs="Arial"/>
-              </w:rPr>
-              <w:t>Jonatas,</w:t>
+              <w:t>Francisco, Luan, Miguel e Jonatas,</w:t>
             </w:r>
           </w:p>
         </w:tc>
@@ -3222,19 +3100,7 @@
         <w:rPr>
           <w:rFonts w:ascii="Arial" w:hAnsi="Arial" w:cs="Arial"/>
         </w:rPr>
-        <w:t>Camila:1</w:t>
-      </w:r>
-      <w:r>
-        <w:rPr>
-          <w:rFonts w:ascii="Arial" w:hAnsi="Arial" w:cs="Arial"/>
-        </w:rPr>
-        <w:t>3</w:t>
-      </w:r>
-      <w:r>
-        <w:rPr>
-          <w:rFonts w:ascii="Arial" w:hAnsi="Arial" w:cs="Arial"/>
-        </w:rPr>
-        <w:t xml:space="preserve"> horas</w:t>
+        <w:t>Camila:13 horas</w:t>
       </w:r>
       <w:r>
         <w:rPr>
@@ -3257,19 +3123,7 @@
         <w:rPr>
           <w:rFonts w:ascii="Arial" w:hAnsi="Arial" w:cs="Arial"/>
         </w:rPr>
-        <w:t>Daniel: 1</w:t>
-      </w:r>
-      <w:r>
-        <w:rPr>
-          <w:rFonts w:ascii="Arial" w:hAnsi="Arial" w:cs="Arial"/>
-        </w:rPr>
-        <w:t>3</w:t>
-      </w:r>
-      <w:r>
-        <w:rPr>
-          <w:rFonts w:ascii="Arial" w:hAnsi="Arial" w:cs="Arial"/>
-        </w:rPr>
-        <w:t xml:space="preserve"> horas</w:t>
+        <w:t>Daniel: 13 horas</w:t>
       </w:r>
     </w:p>
     <w:p>
@@ -3286,19 +3140,7 @@
         <w:rPr>
           <w:rFonts w:ascii="Arial" w:hAnsi="Arial" w:cs="Arial"/>
         </w:rPr>
-        <w:t>Diana:1</w:t>
-      </w:r>
-      <w:r>
-        <w:rPr>
-          <w:rFonts w:ascii="Arial" w:hAnsi="Arial" w:cs="Arial"/>
-        </w:rPr>
-        <w:t>3</w:t>
-      </w:r>
-      <w:r>
-        <w:rPr>
-          <w:rFonts w:ascii="Arial" w:hAnsi="Arial" w:cs="Arial"/>
-        </w:rPr>
-        <w:t xml:space="preserve"> horas</w:t>
+        <w:t>Diana:13 horas</w:t>
       </w:r>
     </w:p>
     <w:p>
@@ -3315,19 +3157,7 @@
         <w:rPr>
           <w:rFonts w:ascii="Arial" w:hAnsi="Arial" w:cs="Arial"/>
         </w:rPr>
-        <w:t>Felipe:1</w:t>
-      </w:r>
-      <w:r>
-        <w:rPr>
-          <w:rFonts w:ascii="Arial" w:hAnsi="Arial" w:cs="Arial"/>
-        </w:rPr>
-        <w:t>3</w:t>
-      </w:r>
-      <w:r>
-        <w:rPr>
-          <w:rFonts w:ascii="Arial" w:hAnsi="Arial" w:cs="Arial"/>
-        </w:rPr>
-        <w:t xml:space="preserve"> horas</w:t>
+        <w:t>Felipe:13 horas</w:t>
       </w:r>
     </w:p>
     <w:p>
@@ -3344,19 +3174,7 @@
         <w:rPr>
           <w:rFonts w:ascii="Arial" w:hAnsi="Arial" w:cs="Arial"/>
         </w:rPr>
-        <w:t>Francisco: 1</w:t>
-      </w:r>
-      <w:r>
-        <w:rPr>
-          <w:rFonts w:ascii="Arial" w:hAnsi="Arial" w:cs="Arial"/>
-        </w:rPr>
-        <w:t>3</w:t>
-      </w:r>
-      <w:r>
-        <w:rPr>
-          <w:rFonts w:ascii="Arial" w:hAnsi="Arial" w:cs="Arial"/>
-        </w:rPr>
-        <w:t xml:space="preserve"> horas</w:t>
+        <w:t>Francisco: 13 horas</w:t>
       </w:r>
     </w:p>
     <w:p>
@@ -3373,19 +3191,7 @@
         <w:rPr>
           <w:rFonts w:ascii="Arial" w:hAnsi="Arial" w:cs="Arial"/>
         </w:rPr>
-        <w:t>Luan:1</w:t>
-      </w:r>
-      <w:r>
-        <w:rPr>
-          <w:rFonts w:ascii="Arial" w:hAnsi="Arial" w:cs="Arial"/>
-        </w:rPr>
-        <w:t>3</w:t>
-      </w:r>
-      <w:r>
-        <w:rPr>
-          <w:rFonts w:ascii="Arial" w:hAnsi="Arial" w:cs="Arial"/>
-        </w:rPr>
-        <w:t xml:space="preserve"> horas</w:t>
+        <w:t>Luan:13 horas</w:t>
       </w:r>
     </w:p>
     <w:p>
@@ -3402,19 +3208,7 @@
         <w:rPr>
           <w:rFonts w:ascii="Arial" w:hAnsi="Arial" w:cs="Arial"/>
         </w:rPr>
-        <w:t>Jonatas:1</w:t>
-      </w:r>
-      <w:r>
-        <w:rPr>
-          <w:rFonts w:ascii="Arial" w:hAnsi="Arial" w:cs="Arial"/>
-        </w:rPr>
-        <w:t>3</w:t>
-      </w:r>
-      <w:r>
-        <w:rPr>
-          <w:rFonts w:ascii="Arial" w:hAnsi="Arial" w:cs="Arial"/>
-        </w:rPr>
-        <w:t xml:space="preserve"> horas</w:t>
+        <w:t>Jonatas:13 horas</w:t>
       </w:r>
     </w:p>
     <w:p>
@@ -3431,19 +3225,7 @@
         <w:rPr>
           <w:rFonts w:ascii="Arial" w:hAnsi="Arial" w:cs="Arial"/>
         </w:rPr>
-        <w:t>Miguel: 1</w:t>
-      </w:r>
-      <w:r>
-        <w:rPr>
-          <w:rFonts w:ascii="Arial" w:hAnsi="Arial" w:cs="Arial"/>
-        </w:rPr>
-        <w:t>3</w:t>
-      </w:r>
-      <w:r>
-        <w:rPr>
-          <w:rFonts w:ascii="Arial" w:hAnsi="Arial" w:cs="Arial"/>
-        </w:rPr>
-        <w:t xml:space="preserve"> horas</w:t>
+        <w:t>Miguel: 13 horas</w:t>
       </w:r>
     </w:p>
     <w:p>
@@ -3648,19 +3430,7 @@
               <w:rPr>
                 <w:rFonts w:ascii="Arial" w:hAnsi="Arial" w:cs="Arial"/>
               </w:rPr>
-              <w:t xml:space="preserve">Francisco, Luan, Miguel </w:t>
-            </w:r>
-            <w:r>
-              <w:rPr>
-                <w:rFonts w:ascii="Arial" w:hAnsi="Arial" w:cs="Arial"/>
-              </w:rPr>
-              <w:t xml:space="preserve">e </w:t>
-            </w:r>
-            <w:r>
-              <w:rPr>
-                <w:rFonts w:ascii="Arial" w:hAnsi="Arial" w:cs="Arial"/>
-              </w:rPr>
-              <w:t>Jonatas,</w:t>
+              <w:t>Francisco, Luan, Miguel e Jonatas,</w:t>
             </w:r>
           </w:p>
         </w:tc>
@@ -3776,19 +3546,7 @@
               <w:rPr>
                 <w:rFonts w:ascii="Arial" w:hAnsi="Arial" w:cs="Arial"/>
               </w:rPr>
-              <w:t xml:space="preserve">Francisco, Luan, Miguel </w:t>
-            </w:r>
-            <w:r>
-              <w:rPr>
-                <w:rFonts w:ascii="Arial" w:hAnsi="Arial" w:cs="Arial"/>
-              </w:rPr>
-              <w:t xml:space="preserve">e </w:t>
-            </w:r>
-            <w:r>
-              <w:rPr>
-                <w:rFonts w:ascii="Arial" w:hAnsi="Arial" w:cs="Arial"/>
-              </w:rPr>
-              <w:t>Jonatas,</w:t>
+              <w:t>Francisco, Luan, Miguel e Jonatas,</w:t>
             </w:r>
           </w:p>
         </w:tc>
@@ -3894,37 +3652,7 @@
               <w:rPr>
                 <w:rFonts w:ascii="Arial" w:hAnsi="Arial" w:cs="Arial"/>
               </w:rPr>
-              <w:t>Camila, Daniel,</w:t>
-            </w:r>
-            <w:r>
-              <w:rPr>
-                <w:rFonts w:ascii="Arial" w:hAnsi="Arial" w:cs="Arial"/>
-              </w:rPr>
-              <w:t xml:space="preserve"> </w:t>
-            </w:r>
-            <w:r>
-              <w:rPr>
-                <w:rFonts w:ascii="Arial" w:hAnsi="Arial" w:cs="Arial"/>
-              </w:rPr>
-              <w:t xml:space="preserve">Francisco, Luan, Miguel </w:t>
-            </w:r>
-            <w:r>
-              <w:rPr>
-                <w:rFonts w:ascii="Arial" w:hAnsi="Arial" w:cs="Arial"/>
-              </w:rPr>
-              <w:t xml:space="preserve">e </w:t>
-            </w:r>
-            <w:r>
-              <w:rPr>
-                <w:rFonts w:ascii="Arial" w:hAnsi="Arial" w:cs="Arial"/>
-              </w:rPr>
-              <w:t>Jonatas</w:t>
-            </w:r>
-            <w:r>
-              <w:rPr>
-                <w:rFonts w:ascii="Arial" w:hAnsi="Arial" w:cs="Arial"/>
-              </w:rPr>
-              <w:t>.</w:t>
+              <w:t>Camila, Daniel, Francisco, Luan, Miguel e Jonatas.</w:t>
             </w:r>
           </w:p>
         </w:tc>
@@ -4113,19 +3841,7 @@
         <w:rPr>
           <w:rFonts w:ascii="Arial" w:hAnsi="Arial" w:cs="Arial"/>
         </w:rPr>
-        <w:t>Camila:1</w:t>
-      </w:r>
-      <w:r>
-        <w:rPr>
-          <w:rFonts w:ascii="Arial" w:hAnsi="Arial" w:cs="Arial"/>
-        </w:rPr>
-        <w:t>0</w:t>
-      </w:r>
-      <w:r>
-        <w:rPr>
-          <w:rFonts w:ascii="Arial" w:hAnsi="Arial" w:cs="Arial"/>
-        </w:rPr>
-        <w:t xml:space="preserve"> horas</w:t>
+        <w:t>Camila:10 horas</w:t>
       </w:r>
       <w:r>
         <w:rPr>
@@ -4148,19 +3864,7 @@
         <w:rPr>
           <w:rFonts w:ascii="Arial" w:hAnsi="Arial" w:cs="Arial"/>
         </w:rPr>
-        <w:t>Daniel: 1</w:t>
-      </w:r>
-      <w:r>
-        <w:rPr>
-          <w:rFonts w:ascii="Arial" w:hAnsi="Arial" w:cs="Arial"/>
-        </w:rPr>
-        <w:t>0</w:t>
-      </w:r>
-      <w:r>
-        <w:rPr>
-          <w:rFonts w:ascii="Arial" w:hAnsi="Arial" w:cs="Arial"/>
-        </w:rPr>
-        <w:t xml:space="preserve"> horas</w:t>
+        <w:t>Daniel: 10 horas</w:t>
       </w:r>
     </w:p>
     <w:p>
@@ -4177,19 +3881,7 @@
         <w:rPr>
           <w:rFonts w:ascii="Arial" w:hAnsi="Arial" w:cs="Arial"/>
         </w:rPr>
-        <w:t>Diana:1</w:t>
-      </w:r>
-      <w:r>
-        <w:rPr>
-          <w:rFonts w:ascii="Arial" w:hAnsi="Arial" w:cs="Arial"/>
-        </w:rPr>
-        <w:t>8</w:t>
-      </w:r>
-      <w:r>
-        <w:rPr>
-          <w:rFonts w:ascii="Arial" w:hAnsi="Arial" w:cs="Arial"/>
-        </w:rPr>
-        <w:t xml:space="preserve"> horas</w:t>
+        <w:t>Diana:18 horas</w:t>
       </w:r>
     </w:p>
     <w:p>
@@ -4206,19 +3898,7 @@
         <w:rPr>
           <w:rFonts w:ascii="Arial" w:hAnsi="Arial" w:cs="Arial"/>
         </w:rPr>
-        <w:t>Felipe:1</w:t>
-      </w:r>
-      <w:r>
-        <w:rPr>
-          <w:rFonts w:ascii="Arial" w:hAnsi="Arial" w:cs="Arial"/>
-        </w:rPr>
-        <w:t>8</w:t>
-      </w:r>
-      <w:r>
-        <w:rPr>
-          <w:rFonts w:ascii="Arial" w:hAnsi="Arial" w:cs="Arial"/>
-        </w:rPr>
-        <w:t xml:space="preserve"> horas</w:t>
+        <w:t>Felipe:18 horas</w:t>
       </w:r>
     </w:p>
     <w:p>
@@ -4235,19 +3915,7 @@
         <w:rPr>
           <w:rFonts w:ascii="Arial" w:hAnsi="Arial" w:cs="Arial"/>
         </w:rPr>
-        <w:t>Francisco: 1</w:t>
-      </w:r>
-      <w:r>
-        <w:rPr>
-          <w:rFonts w:ascii="Arial" w:hAnsi="Arial" w:cs="Arial"/>
-        </w:rPr>
-        <w:t>0</w:t>
-      </w:r>
-      <w:r>
-        <w:rPr>
-          <w:rFonts w:ascii="Arial" w:hAnsi="Arial" w:cs="Arial"/>
-        </w:rPr>
-        <w:t xml:space="preserve"> horas</w:t>
+        <w:t>Francisco: 10 horas</w:t>
       </w:r>
     </w:p>
     <w:p>
@@ -4264,19 +3932,7 @@
         <w:rPr>
           <w:rFonts w:ascii="Arial" w:hAnsi="Arial" w:cs="Arial"/>
         </w:rPr>
-        <w:t>Luan:1</w:t>
-      </w:r>
-      <w:r>
-        <w:rPr>
-          <w:rFonts w:ascii="Arial" w:hAnsi="Arial" w:cs="Arial"/>
-        </w:rPr>
-        <w:t>0</w:t>
-      </w:r>
-      <w:r>
-        <w:rPr>
-          <w:rFonts w:ascii="Arial" w:hAnsi="Arial" w:cs="Arial"/>
-        </w:rPr>
-        <w:t xml:space="preserve"> horas</w:t>
+        <w:t>Luan:10 horas</w:t>
       </w:r>
     </w:p>
     <w:p>
@@ -4293,19 +3949,7 @@
         <w:rPr>
           <w:rFonts w:ascii="Arial" w:hAnsi="Arial" w:cs="Arial"/>
         </w:rPr>
-        <w:t>Jonatas:1</w:t>
-      </w:r>
-      <w:r>
-        <w:rPr>
-          <w:rFonts w:ascii="Arial" w:hAnsi="Arial" w:cs="Arial"/>
-        </w:rPr>
-        <w:t>0</w:t>
-      </w:r>
-      <w:r>
-        <w:rPr>
-          <w:rFonts w:ascii="Arial" w:hAnsi="Arial" w:cs="Arial"/>
-        </w:rPr>
-        <w:t xml:space="preserve"> horas</w:t>
+        <w:t>Jonatas:10 horas</w:t>
       </w:r>
     </w:p>
     <w:p>
@@ -4322,19 +3966,7 @@
         <w:rPr>
           <w:rFonts w:ascii="Arial" w:hAnsi="Arial" w:cs="Arial"/>
         </w:rPr>
-        <w:t>Miguel: 1</w:t>
-      </w:r>
-      <w:r>
-        <w:rPr>
-          <w:rFonts w:ascii="Arial" w:hAnsi="Arial" w:cs="Arial"/>
-        </w:rPr>
-        <w:t>0</w:t>
-      </w:r>
-      <w:r>
-        <w:rPr>
-          <w:rFonts w:ascii="Arial" w:hAnsi="Arial" w:cs="Arial"/>
-        </w:rPr>
-        <w:t xml:space="preserve"> horas</w:t>
+        <w:t>Miguel: 10 horas</w:t>
       </w:r>
     </w:p>
     <w:p>
@@ -4494,12 +4126,11 @@
       </w:tr>
       <w:tr>
         <w:trPr>
-          <w:trHeight w:val="150"/>
+          <w:trHeight w:val="1518"/>
         </w:trPr>
         <w:tc>
           <w:tcPr>
             <w:tcW w:w="1816" w:type="dxa"/>
-            <w:vMerge w:val="restart"/>
             <w:vAlign w:val="center"/>
           </w:tcPr>
           <w:p>
@@ -4512,6 +4143,12 @@
                 <w:rFonts w:ascii="Arial" w:hAnsi="Arial" w:cs="Arial"/>
               </w:rPr>
             </w:pPr>
+            <w:r>
+              <w:rPr>
+                <w:rFonts w:ascii="Arial" w:hAnsi="Arial" w:cs="Arial"/>
+              </w:rPr>
+              <w:t>01/ a 07</w:t>
+            </w:r>
           </w:p>
         </w:tc>
         <w:tc>
@@ -4528,6 +4165,12 @@
                 <w:rFonts w:ascii="Arial" w:hAnsi="Arial" w:cs="Arial"/>
               </w:rPr>
             </w:pPr>
+            <w:r>
+              <w:rPr>
+                <w:rFonts w:ascii="Arial" w:hAnsi="Arial" w:cs="Arial"/>
+              </w:rPr>
+              <w:t>Camila, Daniel, Francisco, Luan, Jonatas e Miguel</w:t>
+            </w:r>
           </w:p>
         </w:tc>
         <w:tc>
@@ -4544,6 +4187,12 @@
                 <w:rFonts w:ascii="Arial" w:hAnsi="Arial" w:cs="Arial"/>
               </w:rPr>
             </w:pPr>
+            <w:r>
+              <w:rPr>
+                <w:rFonts w:ascii="Arial" w:hAnsi="Arial" w:cs="Arial"/>
+              </w:rPr>
+              <w:t>Estudos sobre protocolos de rede e testes iniciais de comunicação local.</w:t>
+            </w:r>
           </w:p>
         </w:tc>
         <w:tc>
@@ -4555,33 +4204,133 @@
               <w:pStyle w:val="PargrafodaLista"/>
               <w:spacing w:line="360" w:lineRule="auto"/>
               <w:ind w:left="0"/>
-              <w:jc w:val="both"/>
-              <w:rPr>
-                <w:rFonts w:ascii="Arial" w:hAnsi="Arial" w:cs="Arial"/>
-              </w:rPr>
-            </w:pPr>
+              <w:rPr>
+                <w:rFonts w:ascii="Arial" w:hAnsi="Arial" w:cs="Arial"/>
+              </w:rPr>
+            </w:pPr>
+            <w:r>
+              <w:rPr>
+                <w:rFonts w:ascii="Arial" w:hAnsi="Arial" w:cs="Arial"/>
+              </w:rPr>
+              <w:t>4h</w:t>
+            </w:r>
+          </w:p>
+        </w:tc>
+      </w:tr>
+      <w:tr>
+        <w:tc>
+          <w:tcPr>
+            <w:tcW w:w="1816" w:type="dxa"/>
+          </w:tcPr>
+          <w:p>
+            <w:pPr>
+              <w:pStyle w:val="PargrafodaLista"/>
+              <w:spacing w:line="360" w:lineRule="auto"/>
+              <w:ind w:left="0"/>
+              <w:jc w:val="both"/>
+              <w:rPr>
+                <w:rFonts w:ascii="Arial" w:hAnsi="Arial" w:cs="Arial"/>
+              </w:rPr>
+            </w:pPr>
+            <w:r>
+              <w:rPr>
+                <w:rFonts w:ascii="Arial" w:hAnsi="Arial" w:cs="Arial"/>
+              </w:rPr>
+              <w:t>01 a 07/06</w:t>
+            </w:r>
+          </w:p>
+        </w:tc>
+        <w:tc>
+          <w:tcPr>
+            <w:tcW w:w="1722" w:type="dxa"/>
+          </w:tcPr>
+          <w:p>
+            <w:pPr>
+              <w:pStyle w:val="PargrafodaLista"/>
+              <w:spacing w:line="360" w:lineRule="auto"/>
+              <w:ind w:left="0"/>
+              <w:jc w:val="both"/>
+              <w:rPr>
+                <w:rFonts w:ascii="Arial" w:hAnsi="Arial" w:cs="Arial"/>
+              </w:rPr>
+            </w:pPr>
+            <w:r>
+              <w:rPr>
+                <w:rFonts w:ascii="Arial" w:hAnsi="Arial" w:cs="Arial"/>
+              </w:rPr>
+              <w:t>Diana e Felipe</w:t>
+            </w:r>
+          </w:p>
+        </w:tc>
+        <w:tc>
+          <w:tcPr>
+            <w:tcW w:w="2758" w:type="dxa"/>
+          </w:tcPr>
+          <w:p>
+            <w:pPr>
+              <w:pStyle w:val="PargrafodaLista"/>
+              <w:spacing w:line="360" w:lineRule="auto"/>
+              <w:ind w:left="0"/>
+              <w:jc w:val="both"/>
+              <w:rPr>
+                <w:rFonts w:ascii="Arial" w:hAnsi="Arial" w:cs="Arial"/>
+              </w:rPr>
+            </w:pPr>
+            <w:r>
+              <w:rPr>
+                <w:rFonts w:ascii="Arial" w:hAnsi="Arial" w:cs="Arial"/>
+              </w:rPr>
+              <w:t>Rascunhos conceituais sobre a interface e layout do sistema.</w:t>
+            </w:r>
+          </w:p>
+        </w:tc>
+        <w:tc>
+          <w:tcPr>
+            <w:tcW w:w="1772" w:type="dxa"/>
+          </w:tcPr>
+          <w:p>
+            <w:pPr>
+              <w:pStyle w:val="PargrafodaLista"/>
+              <w:spacing w:line="360" w:lineRule="auto"/>
+              <w:ind w:left="0"/>
+              <w:jc w:val="both"/>
+              <w:rPr>
+                <w:rFonts w:ascii="Arial" w:hAnsi="Arial" w:cs="Arial"/>
+              </w:rPr>
+            </w:pPr>
+            <w:r>
+              <w:rPr>
+                <w:rFonts w:ascii="Arial" w:hAnsi="Arial" w:cs="Arial"/>
+              </w:rPr>
+              <w:t>4h</w:t>
+            </w:r>
           </w:p>
         </w:tc>
       </w:tr>
       <w:tr>
         <w:trPr>
-          <w:trHeight w:val="149"/>
+          <w:trHeight w:val="769"/>
         </w:trPr>
         <w:tc>
           <w:tcPr>
             <w:tcW w:w="1816" w:type="dxa"/>
-            <w:vMerge/>
-          </w:tcPr>
-          <w:p>
-            <w:pPr>
-              <w:pStyle w:val="PargrafodaLista"/>
-              <w:spacing w:line="360" w:lineRule="auto"/>
-              <w:ind w:left="0"/>
-              <w:jc w:val="both"/>
-              <w:rPr>
-                <w:rFonts w:ascii="Arial" w:hAnsi="Arial" w:cs="Arial"/>
-              </w:rPr>
-            </w:pPr>
+          </w:tcPr>
+          <w:p>
+            <w:pPr>
+              <w:pStyle w:val="PargrafodaLista"/>
+              <w:spacing w:line="360" w:lineRule="auto"/>
+              <w:ind w:left="0"/>
+              <w:jc w:val="both"/>
+              <w:rPr>
+                <w:rFonts w:ascii="Arial" w:hAnsi="Arial" w:cs="Arial"/>
+              </w:rPr>
+            </w:pPr>
+            <w:r>
+              <w:rPr>
+                <w:rFonts w:ascii="Arial" w:hAnsi="Arial" w:cs="Arial"/>
+              </w:rPr>
+              <w:t>08 a 15/06</w:t>
+            </w:r>
           </w:p>
         </w:tc>
         <w:tc>
@@ -4598,6 +4347,12 @@
                 <w:rFonts w:ascii="Arial" w:hAnsi="Arial" w:cs="Arial"/>
               </w:rPr>
             </w:pPr>
+            <w:r>
+              <w:rPr>
+                <w:rFonts w:ascii="Arial" w:hAnsi="Arial" w:cs="Arial"/>
+              </w:rPr>
+              <w:t>Todos os integrantes</w:t>
+            </w:r>
           </w:p>
         </w:tc>
         <w:tc>
@@ -4614,6 +4369,12 @@
                 <w:rFonts w:ascii="Arial" w:hAnsi="Arial" w:cs="Arial"/>
               </w:rPr>
             </w:pPr>
+            <w:r>
+              <w:rPr>
+                <w:rFonts w:ascii="Arial" w:hAnsi="Arial" w:cs="Arial"/>
+              </w:rPr>
+              <w:t>Organização dos materiais teóricos e revisão das correções do manuscrito.</w:t>
+            </w:r>
           </w:p>
         </w:tc>
         <w:tc>
@@ -4630,94 +4391,39 @@
                 <w:rFonts w:ascii="Arial" w:hAnsi="Arial" w:cs="Arial"/>
               </w:rPr>
             </w:pPr>
-          </w:p>
-        </w:tc>
-      </w:tr>
-      <w:tr>
-        <w:tc>
-          <w:tcPr>
-            <w:tcW w:w="1816" w:type="dxa"/>
-          </w:tcPr>
-          <w:p>
-            <w:pPr>
-              <w:pStyle w:val="PargrafodaLista"/>
-              <w:spacing w:line="360" w:lineRule="auto"/>
-              <w:ind w:left="0"/>
-              <w:jc w:val="both"/>
-              <w:rPr>
-                <w:rFonts w:ascii="Arial" w:hAnsi="Arial" w:cs="Arial"/>
-              </w:rPr>
-            </w:pPr>
-          </w:p>
-        </w:tc>
-        <w:tc>
-          <w:tcPr>
-            <w:tcW w:w="1722" w:type="dxa"/>
-          </w:tcPr>
-          <w:p>
-            <w:pPr>
-              <w:pStyle w:val="PargrafodaLista"/>
-              <w:spacing w:line="360" w:lineRule="auto"/>
-              <w:ind w:left="0"/>
-              <w:jc w:val="both"/>
-              <w:rPr>
-                <w:rFonts w:ascii="Arial" w:hAnsi="Arial" w:cs="Arial"/>
-              </w:rPr>
-            </w:pPr>
-          </w:p>
-        </w:tc>
-        <w:tc>
-          <w:tcPr>
-            <w:tcW w:w="2758" w:type="dxa"/>
-          </w:tcPr>
-          <w:p>
-            <w:pPr>
-              <w:pStyle w:val="PargrafodaLista"/>
-              <w:spacing w:line="360" w:lineRule="auto"/>
-              <w:ind w:left="0"/>
-              <w:jc w:val="both"/>
-              <w:rPr>
-                <w:rFonts w:ascii="Arial" w:hAnsi="Arial" w:cs="Arial"/>
-              </w:rPr>
-            </w:pPr>
-          </w:p>
-        </w:tc>
-        <w:tc>
-          <w:tcPr>
-            <w:tcW w:w="1772" w:type="dxa"/>
-          </w:tcPr>
-          <w:p>
-            <w:pPr>
-              <w:pStyle w:val="PargrafodaLista"/>
-              <w:spacing w:line="360" w:lineRule="auto"/>
-              <w:ind w:left="0"/>
-              <w:jc w:val="both"/>
-              <w:rPr>
-                <w:rFonts w:ascii="Arial" w:hAnsi="Arial" w:cs="Arial"/>
-              </w:rPr>
-            </w:pPr>
+            <w:r>
+              <w:rPr>
+                <w:rFonts w:ascii="Arial" w:hAnsi="Arial" w:cs="Arial"/>
+              </w:rPr>
+              <w:t>4h</w:t>
+            </w:r>
           </w:p>
         </w:tc>
       </w:tr>
       <w:tr>
         <w:trPr>
-          <w:trHeight w:val="101"/>
+          <w:trHeight w:val="769"/>
         </w:trPr>
         <w:tc>
           <w:tcPr>
             <w:tcW w:w="1816" w:type="dxa"/>
-            <w:vMerge w:val="restart"/>
-          </w:tcPr>
-          <w:p>
-            <w:pPr>
-              <w:pStyle w:val="PargrafodaLista"/>
-              <w:spacing w:line="360" w:lineRule="auto"/>
-              <w:ind w:left="0"/>
-              <w:jc w:val="both"/>
-              <w:rPr>
-                <w:rFonts w:ascii="Arial" w:hAnsi="Arial" w:cs="Arial"/>
-              </w:rPr>
-            </w:pPr>
+          </w:tcPr>
+          <w:p>
+            <w:pPr>
+              <w:pStyle w:val="PargrafodaLista"/>
+              <w:spacing w:line="360" w:lineRule="auto"/>
+              <w:ind w:left="0"/>
+              <w:jc w:val="both"/>
+              <w:rPr>
+                <w:rFonts w:ascii="Arial" w:hAnsi="Arial" w:cs="Arial"/>
+              </w:rPr>
+            </w:pPr>
+            <w:r>
+              <w:rPr>
+                <w:rFonts w:ascii="Arial" w:hAnsi="Arial" w:cs="Arial"/>
+              </w:rPr>
+              <w:t>16 a 22/06</w:t>
+            </w:r>
           </w:p>
         </w:tc>
         <w:tc>
@@ -4734,6 +4440,12 @@
                 <w:rFonts w:ascii="Arial" w:hAnsi="Arial" w:cs="Arial"/>
               </w:rPr>
             </w:pPr>
+            <w:r>
+              <w:rPr>
+                <w:rFonts w:ascii="Arial" w:hAnsi="Arial" w:cs="Arial"/>
+              </w:rPr>
+              <w:t>Todos os integrantes</w:t>
+            </w:r>
           </w:p>
         </w:tc>
         <w:tc>
@@ -4750,6 +4462,12 @@
                 <w:rFonts w:ascii="Arial" w:hAnsi="Arial" w:cs="Arial"/>
               </w:rPr>
             </w:pPr>
+            <w:r>
+              <w:rPr>
+                <w:rFonts w:ascii="Arial" w:hAnsi="Arial" w:cs="Arial"/>
+              </w:rPr>
+              <w:t>Fechamento do relatório das atividades do 1º semestre antes das férias</w:t>
+            </w:r>
           </w:p>
         </w:tc>
         <w:tc>
@@ -4766,215 +4484,12 @@
                 <w:rFonts w:ascii="Arial" w:hAnsi="Arial" w:cs="Arial"/>
               </w:rPr>
             </w:pPr>
-          </w:p>
-        </w:tc>
-      </w:tr>
-      <w:tr>
-        <w:trPr>
-          <w:trHeight w:val="99"/>
-        </w:trPr>
-        <w:tc>
-          <w:tcPr>
-            <w:tcW w:w="1816" w:type="dxa"/>
-            <w:vMerge/>
-          </w:tcPr>
-          <w:p>
-            <w:pPr>
-              <w:pStyle w:val="PargrafodaLista"/>
-              <w:spacing w:line="360" w:lineRule="auto"/>
-              <w:ind w:left="0"/>
-              <w:jc w:val="both"/>
-              <w:rPr>
-                <w:rFonts w:ascii="Arial" w:hAnsi="Arial" w:cs="Arial"/>
-              </w:rPr>
-            </w:pPr>
-          </w:p>
-        </w:tc>
-        <w:tc>
-          <w:tcPr>
-            <w:tcW w:w="1722" w:type="dxa"/>
-          </w:tcPr>
-          <w:p>
-            <w:pPr>
-              <w:pStyle w:val="PargrafodaLista"/>
-              <w:spacing w:line="360" w:lineRule="auto"/>
-              <w:ind w:left="0"/>
-              <w:jc w:val="both"/>
-              <w:rPr>
-                <w:rFonts w:ascii="Arial" w:hAnsi="Arial" w:cs="Arial"/>
-              </w:rPr>
-            </w:pPr>
-          </w:p>
-        </w:tc>
-        <w:tc>
-          <w:tcPr>
-            <w:tcW w:w="2758" w:type="dxa"/>
-          </w:tcPr>
-          <w:p>
-            <w:pPr>
-              <w:pStyle w:val="PargrafodaLista"/>
-              <w:spacing w:line="360" w:lineRule="auto"/>
-              <w:ind w:left="0"/>
-              <w:jc w:val="both"/>
-              <w:rPr>
-                <w:rFonts w:ascii="Arial" w:hAnsi="Arial" w:cs="Arial"/>
-              </w:rPr>
-            </w:pPr>
-          </w:p>
-        </w:tc>
-        <w:tc>
-          <w:tcPr>
-            <w:tcW w:w="1772" w:type="dxa"/>
-          </w:tcPr>
-          <w:p>
-            <w:pPr>
-              <w:pStyle w:val="PargrafodaLista"/>
-              <w:spacing w:line="360" w:lineRule="auto"/>
-              <w:ind w:left="0"/>
-              <w:jc w:val="both"/>
-              <w:rPr>
-                <w:rFonts w:ascii="Arial" w:hAnsi="Arial" w:cs="Arial"/>
-              </w:rPr>
-            </w:pPr>
-          </w:p>
-        </w:tc>
-      </w:tr>
-      <w:tr>
-        <w:trPr>
-          <w:trHeight w:val="99"/>
-        </w:trPr>
-        <w:tc>
-          <w:tcPr>
-            <w:tcW w:w="1816" w:type="dxa"/>
-            <w:vMerge/>
-          </w:tcPr>
-          <w:p>
-            <w:pPr>
-              <w:pStyle w:val="PargrafodaLista"/>
-              <w:spacing w:line="360" w:lineRule="auto"/>
-              <w:ind w:left="0"/>
-              <w:jc w:val="both"/>
-              <w:rPr>
-                <w:rFonts w:ascii="Arial" w:hAnsi="Arial" w:cs="Arial"/>
-              </w:rPr>
-            </w:pPr>
-          </w:p>
-        </w:tc>
-        <w:tc>
-          <w:tcPr>
-            <w:tcW w:w="1722" w:type="dxa"/>
-          </w:tcPr>
-          <w:p>
-            <w:pPr>
-              <w:pStyle w:val="PargrafodaLista"/>
-              <w:spacing w:line="360" w:lineRule="auto"/>
-              <w:ind w:left="0"/>
-              <w:jc w:val="both"/>
-              <w:rPr>
-                <w:rFonts w:ascii="Arial" w:hAnsi="Arial" w:cs="Arial"/>
-              </w:rPr>
-            </w:pPr>
-          </w:p>
-        </w:tc>
-        <w:tc>
-          <w:tcPr>
-            <w:tcW w:w="2758" w:type="dxa"/>
-          </w:tcPr>
-          <w:p>
-            <w:pPr>
-              <w:pStyle w:val="PargrafodaLista"/>
-              <w:spacing w:line="360" w:lineRule="auto"/>
-              <w:ind w:left="0"/>
-              <w:jc w:val="both"/>
-              <w:rPr>
-                <w:rFonts w:ascii="Arial" w:hAnsi="Arial" w:cs="Arial"/>
-              </w:rPr>
-            </w:pPr>
-          </w:p>
-        </w:tc>
-        <w:tc>
-          <w:tcPr>
-            <w:tcW w:w="1772" w:type="dxa"/>
-          </w:tcPr>
-          <w:p>
-            <w:pPr>
-              <w:pStyle w:val="PargrafodaLista"/>
-              <w:spacing w:line="360" w:lineRule="auto"/>
-              <w:ind w:left="0"/>
-              <w:jc w:val="both"/>
-              <w:rPr>
-                <w:rFonts w:ascii="Arial" w:hAnsi="Arial" w:cs="Arial"/>
-              </w:rPr>
-            </w:pPr>
-          </w:p>
-        </w:tc>
-      </w:tr>
-      <w:tr>
-        <w:trPr>
-          <w:trHeight w:val="99"/>
-        </w:trPr>
-        <w:tc>
-          <w:tcPr>
-            <w:tcW w:w="1816" w:type="dxa"/>
-          </w:tcPr>
-          <w:p>
-            <w:pPr>
-              <w:pStyle w:val="PargrafodaLista"/>
-              <w:spacing w:line="360" w:lineRule="auto"/>
-              <w:ind w:left="0"/>
-              <w:jc w:val="both"/>
-              <w:rPr>
-                <w:rFonts w:ascii="Arial" w:hAnsi="Arial" w:cs="Arial"/>
-              </w:rPr>
-            </w:pPr>
-          </w:p>
-        </w:tc>
-        <w:tc>
-          <w:tcPr>
-            <w:tcW w:w="1722" w:type="dxa"/>
-          </w:tcPr>
-          <w:p>
-            <w:pPr>
-              <w:pStyle w:val="PargrafodaLista"/>
-              <w:spacing w:line="360" w:lineRule="auto"/>
-              <w:ind w:left="0"/>
-              <w:jc w:val="both"/>
-              <w:rPr>
-                <w:rFonts w:ascii="Arial" w:hAnsi="Arial" w:cs="Arial"/>
-              </w:rPr>
-            </w:pPr>
-          </w:p>
-        </w:tc>
-        <w:tc>
-          <w:tcPr>
-            <w:tcW w:w="2758" w:type="dxa"/>
-          </w:tcPr>
-          <w:p>
-            <w:pPr>
-              <w:pStyle w:val="PargrafodaLista"/>
-              <w:spacing w:line="360" w:lineRule="auto"/>
-              <w:ind w:left="0"/>
-              <w:jc w:val="both"/>
-              <w:rPr>
-                <w:rFonts w:ascii="Arial" w:hAnsi="Arial" w:cs="Arial"/>
-              </w:rPr>
-            </w:pPr>
-          </w:p>
-        </w:tc>
-        <w:tc>
-          <w:tcPr>
-            <w:tcW w:w="1772" w:type="dxa"/>
-          </w:tcPr>
-          <w:p>
-            <w:pPr>
-              <w:pStyle w:val="PargrafodaLista"/>
-              <w:spacing w:line="360" w:lineRule="auto"/>
-              <w:ind w:left="0"/>
-              <w:jc w:val="both"/>
-              <w:rPr>
-                <w:rFonts w:ascii="Arial" w:hAnsi="Arial" w:cs="Arial"/>
-              </w:rPr>
-            </w:pPr>
+            <w:r>
+              <w:rPr>
+                <w:rFonts w:ascii="Arial" w:hAnsi="Arial" w:cs="Arial"/>
+              </w:rPr>
+              <w:t>3h</w:t>
+            </w:r>
           </w:p>
         </w:tc>
       </w:tr>
@@ -4993,7 +4508,7 @@
         <w:rPr>
           <w:rFonts w:ascii="Arial" w:hAnsi="Arial" w:cs="Arial"/>
         </w:rPr>
-        <w:t xml:space="preserve">Cálculo das horas mensais: </w:t>
+        <w:t>Cálculo das horas mensais:</w:t>
       </w:r>
     </w:p>
     <w:p>
@@ -5006,24 +4521,6 @@
           <w:rFonts w:ascii="Arial" w:hAnsi="Arial" w:cs="Arial"/>
         </w:rPr>
       </w:pPr>
-      <w:r>
-        <w:rPr>
-          <w:rFonts w:ascii="Arial" w:hAnsi="Arial" w:cs="Arial"/>
-        </w:rPr>
-        <w:t xml:space="preserve">Integrante 1: </w:t>
-      </w:r>
-      <w:r>
-        <w:rPr>
-          <w:rFonts w:ascii="Arial" w:hAnsi="Arial" w:cs="Arial"/>
-        </w:rPr>
-        <w:t>x</w:t>
-      </w:r>
-      <w:r>
-        <w:rPr>
-          <w:rFonts w:ascii="Arial" w:hAnsi="Arial" w:cs="Arial"/>
-        </w:rPr>
-        <w:t xml:space="preserve"> horas</w:t>
-      </w:r>
     </w:p>
     <w:p>
       <w:pPr>
@@ -5039,19 +4536,7 @@
         <w:rPr>
           <w:rFonts w:ascii="Arial" w:hAnsi="Arial" w:cs="Arial"/>
         </w:rPr>
-        <w:t xml:space="preserve">Integrante 2: </w:t>
-      </w:r>
-      <w:r>
-        <w:rPr>
-          <w:rFonts w:ascii="Arial" w:hAnsi="Arial" w:cs="Arial"/>
-        </w:rPr>
-        <w:t>x</w:t>
-      </w:r>
-      <w:r>
-        <w:rPr>
-          <w:rFonts w:ascii="Arial" w:hAnsi="Arial" w:cs="Arial"/>
-        </w:rPr>
-        <w:t xml:space="preserve"> horas</w:t>
+        <w:t>Camila: 11 horas</w:t>
       </w:r>
     </w:p>
     <w:p>
@@ -5068,19 +4553,14 @@
         <w:rPr>
           <w:rFonts w:ascii="Arial" w:hAnsi="Arial" w:cs="Arial"/>
         </w:rPr>
-        <w:t xml:space="preserve">Integrante 3: </w:t>
-      </w:r>
-      <w:r>
-        <w:rPr>
-          <w:rFonts w:ascii="Arial" w:hAnsi="Arial" w:cs="Arial"/>
-        </w:rPr>
-        <w:t xml:space="preserve">x </w:t>
-      </w:r>
-      <w:r>
-        <w:rPr>
-          <w:rFonts w:ascii="Arial" w:hAnsi="Arial" w:cs="Arial"/>
-        </w:rPr>
-        <w:t>horas</w:t>
+        <w:lastRenderedPageBreak/>
+        <w:t>Daniel: 11 hora</w:t>
+      </w:r>
+      <w:r>
+        <w:rPr>
+          <w:rFonts w:ascii="Arial" w:hAnsi="Arial" w:cs="Arial"/>
+        </w:rPr>
+        <w:t>s</w:t>
       </w:r>
     </w:p>
     <w:p>
@@ -5097,19 +4577,7 @@
         <w:rPr>
           <w:rFonts w:ascii="Arial" w:hAnsi="Arial" w:cs="Arial"/>
         </w:rPr>
-        <w:t xml:space="preserve">Integrante 4: </w:t>
-      </w:r>
-      <w:r>
-        <w:rPr>
-          <w:rFonts w:ascii="Arial" w:hAnsi="Arial" w:cs="Arial"/>
-        </w:rPr>
-        <w:t>x</w:t>
-      </w:r>
-      <w:r>
-        <w:rPr>
-          <w:rFonts w:ascii="Arial" w:hAnsi="Arial" w:cs="Arial"/>
-        </w:rPr>
-        <w:t xml:space="preserve"> horas</w:t>
+        <w:t>Diana: 11 horas</w:t>
       </w:r>
     </w:p>
     <w:p>
@@ -5126,19 +4594,7 @@
         <w:rPr>
           <w:rFonts w:ascii="Arial" w:hAnsi="Arial" w:cs="Arial"/>
         </w:rPr>
-        <w:t xml:space="preserve">Integrante 5: </w:t>
-      </w:r>
-      <w:r>
-        <w:rPr>
-          <w:rFonts w:ascii="Arial" w:hAnsi="Arial" w:cs="Arial"/>
-        </w:rPr>
-        <w:t>x</w:t>
-      </w:r>
-      <w:r>
-        <w:rPr>
-          <w:rFonts w:ascii="Arial" w:hAnsi="Arial" w:cs="Arial"/>
-        </w:rPr>
-        <w:t xml:space="preserve"> horas</w:t>
+        <w:t>Felipe: 11 horas</w:t>
       </w:r>
     </w:p>
     <w:p>
@@ -5151,6 +4607,63 @@
           <w:rFonts w:ascii="Arial" w:hAnsi="Arial" w:cs="Arial"/>
         </w:rPr>
       </w:pPr>
+      <w:r>
+        <w:rPr>
+          <w:rFonts w:ascii="Arial" w:hAnsi="Arial" w:cs="Arial"/>
+        </w:rPr>
+        <w:t>Francisco: 11 horas</w:t>
+      </w:r>
+    </w:p>
+    <w:p>
+      <w:pPr>
+        <w:pStyle w:val="PargrafodaLista"/>
+        <w:spacing w:line="360" w:lineRule="auto"/>
+        <w:ind w:left="426"/>
+        <w:jc w:val="both"/>
+        <w:rPr>
+          <w:rFonts w:ascii="Arial" w:hAnsi="Arial" w:cs="Arial"/>
+        </w:rPr>
+      </w:pPr>
+      <w:r>
+        <w:rPr>
+          <w:rFonts w:ascii="Arial" w:hAnsi="Arial" w:cs="Arial"/>
+        </w:rPr>
+        <w:t>Luan: 11 horas</w:t>
+      </w:r>
+    </w:p>
+    <w:p>
+      <w:pPr>
+        <w:pStyle w:val="PargrafodaLista"/>
+        <w:spacing w:line="360" w:lineRule="auto"/>
+        <w:ind w:left="426"/>
+        <w:jc w:val="both"/>
+        <w:rPr>
+          <w:rFonts w:ascii="Arial" w:hAnsi="Arial" w:cs="Arial"/>
+        </w:rPr>
+      </w:pPr>
+      <w:r>
+        <w:rPr>
+          <w:rFonts w:ascii="Arial" w:hAnsi="Arial" w:cs="Arial"/>
+        </w:rPr>
+        <w:t>Jonatas: 11 horas</w:t>
+      </w:r>
+    </w:p>
+    <w:p>
+      <w:pPr>
+        <w:pStyle w:val="PargrafodaLista"/>
+        <w:spacing w:line="360" w:lineRule="auto"/>
+        <w:ind w:left="426"/>
+        <w:jc w:val="both"/>
+        <w:rPr>
+          <w:rFonts w:ascii="Arial" w:hAnsi="Arial" w:cs="Arial"/>
+        </w:rPr>
+      </w:pPr>
+      <w:r>
+        <w:rPr>
+          <w:rFonts w:ascii="Arial" w:hAnsi="Arial" w:cs="Arial"/>
+        </w:rPr>
+        <w:t>Miguel: 11 horas</w:t>
+      </w:r>
     </w:p>
     <w:p>
       <w:pPr>
@@ -5224,7 +4737,6 @@
                 <w:b/>
                 <w:bCs/>
               </w:rPr>
-              <w:lastRenderedPageBreak/>
               <w:t>Período</w:t>
             </w:r>
           </w:p>
@@ -5310,12 +4822,11 @@
       </w:tr>
       <w:tr>
         <w:trPr>
-          <w:trHeight w:val="150"/>
+          <w:trHeight w:val="1208"/>
         </w:trPr>
         <w:tc>
           <w:tcPr>
             <w:tcW w:w="1816" w:type="dxa"/>
-            <w:vMerge w:val="restart"/>
             <w:vAlign w:val="center"/>
           </w:tcPr>
           <w:p>
@@ -5328,6 +4839,12 @@
                 <w:rFonts w:ascii="Arial" w:hAnsi="Arial" w:cs="Arial"/>
               </w:rPr>
             </w:pPr>
+            <w:r>
+              <w:rPr>
+                <w:rFonts w:ascii="Arial" w:hAnsi="Arial" w:cs="Arial"/>
+              </w:rPr>
+              <w:t>01 a 12/07</w:t>
+            </w:r>
           </w:p>
         </w:tc>
         <w:tc>
@@ -5344,6 +4861,12 @@
                 <w:rFonts w:ascii="Arial" w:hAnsi="Arial" w:cs="Arial"/>
               </w:rPr>
             </w:pPr>
+            <w:r>
+              <w:rPr>
+                <w:rFonts w:ascii="Arial" w:hAnsi="Arial" w:cs="Arial"/>
+              </w:rPr>
+              <w:t>Camila, Daniel, Francisco, Luan, Jonatas e Miguel</w:t>
+            </w:r>
           </w:p>
         </w:tc>
         <w:tc>
@@ -5360,6 +4883,12 @@
                 <w:rFonts w:ascii="Arial" w:hAnsi="Arial" w:cs="Arial"/>
               </w:rPr>
             </w:pPr>
+            <w:r>
+              <w:rPr>
+                <w:rFonts w:ascii="Arial" w:hAnsi="Arial" w:cs="Arial"/>
+              </w:rPr>
+              <w:t>Testes de bancada para validação de conexões locais e ambiente virtual.</w:t>
+            </w:r>
           </w:p>
         </w:tc>
         <w:tc>
@@ -5376,28 +4905,39 @@
                 <w:rFonts w:ascii="Arial" w:hAnsi="Arial" w:cs="Arial"/>
               </w:rPr>
             </w:pPr>
+            <w:r>
+              <w:rPr>
+                <w:rFonts w:ascii="Arial" w:hAnsi="Arial" w:cs="Arial"/>
+              </w:rPr>
+              <w:t>4h</w:t>
+            </w:r>
           </w:p>
         </w:tc>
       </w:tr>
       <w:tr>
         <w:trPr>
-          <w:trHeight w:val="149"/>
+          <w:trHeight w:val="769"/>
         </w:trPr>
         <w:tc>
           <w:tcPr>
             <w:tcW w:w="1816" w:type="dxa"/>
-            <w:vMerge/>
-          </w:tcPr>
-          <w:p>
-            <w:pPr>
-              <w:pStyle w:val="PargrafodaLista"/>
-              <w:spacing w:line="360" w:lineRule="auto"/>
-              <w:ind w:left="0"/>
-              <w:jc w:val="both"/>
-              <w:rPr>
-                <w:rFonts w:ascii="Arial" w:hAnsi="Arial" w:cs="Arial"/>
-              </w:rPr>
-            </w:pPr>
+          </w:tcPr>
+          <w:p>
+            <w:pPr>
+              <w:pStyle w:val="PargrafodaLista"/>
+              <w:spacing w:line="360" w:lineRule="auto"/>
+              <w:ind w:left="0"/>
+              <w:jc w:val="both"/>
+              <w:rPr>
+                <w:rFonts w:ascii="Arial" w:hAnsi="Arial" w:cs="Arial"/>
+              </w:rPr>
+            </w:pPr>
+            <w:r>
+              <w:rPr>
+                <w:rFonts w:ascii="Arial" w:hAnsi="Arial" w:cs="Arial"/>
+              </w:rPr>
+              <w:t>01 a 12/07</w:t>
+            </w:r>
           </w:p>
         </w:tc>
         <w:tc>
@@ -5414,6 +4954,12 @@
                 <w:rFonts w:ascii="Arial" w:hAnsi="Arial" w:cs="Arial"/>
               </w:rPr>
             </w:pPr>
+            <w:r>
+              <w:rPr>
+                <w:rFonts w:ascii="Arial" w:hAnsi="Arial" w:cs="Arial"/>
+              </w:rPr>
+              <w:t>Diana e Felipe</w:t>
+            </w:r>
           </w:p>
         </w:tc>
         <w:tc>
@@ -5430,6 +4976,12 @@
                 <w:rFonts w:ascii="Arial" w:hAnsi="Arial" w:cs="Arial"/>
               </w:rPr>
             </w:pPr>
+            <w:r>
+              <w:rPr>
+                <w:rFonts w:ascii="Arial" w:hAnsi="Arial" w:cs="Arial"/>
+              </w:rPr>
+              <w:t>Testes iniciais de estrutura e componentes de telas.</w:t>
+            </w:r>
           </w:p>
         </w:tc>
         <w:tc>
@@ -5446,94 +4998,39 @@
                 <w:rFonts w:ascii="Arial" w:hAnsi="Arial" w:cs="Arial"/>
               </w:rPr>
             </w:pPr>
-          </w:p>
-        </w:tc>
-      </w:tr>
-      <w:tr>
-        <w:tc>
-          <w:tcPr>
-            <w:tcW w:w="1816" w:type="dxa"/>
-          </w:tcPr>
-          <w:p>
-            <w:pPr>
-              <w:pStyle w:val="PargrafodaLista"/>
-              <w:spacing w:line="360" w:lineRule="auto"/>
-              <w:ind w:left="0"/>
-              <w:jc w:val="both"/>
-              <w:rPr>
-                <w:rFonts w:ascii="Arial" w:hAnsi="Arial" w:cs="Arial"/>
-              </w:rPr>
-            </w:pPr>
-          </w:p>
-        </w:tc>
-        <w:tc>
-          <w:tcPr>
-            <w:tcW w:w="1722" w:type="dxa"/>
-          </w:tcPr>
-          <w:p>
-            <w:pPr>
-              <w:pStyle w:val="PargrafodaLista"/>
-              <w:spacing w:line="360" w:lineRule="auto"/>
-              <w:ind w:left="0"/>
-              <w:jc w:val="both"/>
-              <w:rPr>
-                <w:rFonts w:ascii="Arial" w:hAnsi="Arial" w:cs="Arial"/>
-              </w:rPr>
-            </w:pPr>
-          </w:p>
-        </w:tc>
-        <w:tc>
-          <w:tcPr>
-            <w:tcW w:w="2758" w:type="dxa"/>
-          </w:tcPr>
-          <w:p>
-            <w:pPr>
-              <w:pStyle w:val="PargrafodaLista"/>
-              <w:spacing w:line="360" w:lineRule="auto"/>
-              <w:ind w:left="0"/>
-              <w:jc w:val="both"/>
-              <w:rPr>
-                <w:rFonts w:ascii="Arial" w:hAnsi="Arial" w:cs="Arial"/>
-              </w:rPr>
-            </w:pPr>
-          </w:p>
-        </w:tc>
-        <w:tc>
-          <w:tcPr>
-            <w:tcW w:w="1772" w:type="dxa"/>
-          </w:tcPr>
-          <w:p>
-            <w:pPr>
-              <w:pStyle w:val="PargrafodaLista"/>
-              <w:spacing w:line="360" w:lineRule="auto"/>
-              <w:ind w:left="0"/>
-              <w:jc w:val="both"/>
-              <w:rPr>
-                <w:rFonts w:ascii="Arial" w:hAnsi="Arial" w:cs="Arial"/>
-              </w:rPr>
-            </w:pPr>
+            <w:r>
+              <w:rPr>
+                <w:rFonts w:ascii="Arial" w:hAnsi="Arial" w:cs="Arial"/>
+              </w:rPr>
+              <w:t>4h</w:t>
+            </w:r>
           </w:p>
         </w:tc>
       </w:tr>
       <w:tr>
         <w:trPr>
-          <w:trHeight w:val="101"/>
+          <w:trHeight w:val="769"/>
         </w:trPr>
         <w:tc>
           <w:tcPr>
             <w:tcW w:w="1816" w:type="dxa"/>
-            <w:vMerge w:val="restart"/>
-          </w:tcPr>
-          <w:p>
-            <w:pPr>
-              <w:pStyle w:val="PargrafodaLista"/>
-              <w:spacing w:line="360" w:lineRule="auto"/>
-              <w:ind w:left="0"/>
-              <w:jc w:val="both"/>
-              <w:rPr>
-                <w:rFonts w:ascii="Arial" w:hAnsi="Arial" w:cs="Arial"/>
-              </w:rPr>
-            </w:pPr>
+          </w:tcPr>
+          <w:p>
+            <w:pPr>
+              <w:pStyle w:val="PargrafodaLista"/>
+              <w:spacing w:line="360" w:lineRule="auto"/>
+              <w:ind w:left="0"/>
+              <w:jc w:val="both"/>
+              <w:rPr>
+                <w:rFonts w:ascii="Arial" w:hAnsi="Arial" w:cs="Arial"/>
+              </w:rPr>
+            </w:pPr>
+            <w:r>
+              <w:rPr>
+                <w:rFonts w:ascii="Arial" w:hAnsi="Arial" w:cs="Arial"/>
+              </w:rPr>
+              <w:t>13 a 31/07</w:t>
+            </w:r>
           </w:p>
         </w:tc>
         <w:tc>
@@ -5550,6 +5047,12 @@
                 <w:rFonts w:ascii="Arial" w:hAnsi="Arial" w:cs="Arial"/>
               </w:rPr>
             </w:pPr>
+            <w:r>
+              <w:rPr>
+                <w:rFonts w:ascii="Arial" w:hAnsi="Arial" w:cs="Arial"/>
+              </w:rPr>
+              <w:t>Todos os integrantes</w:t>
+            </w:r>
           </w:p>
         </w:tc>
         <w:tc>
@@ -5566,6 +5069,12 @@
                 <w:rFonts w:ascii="Arial" w:hAnsi="Arial" w:cs="Arial"/>
               </w:rPr>
             </w:pPr>
+            <w:r>
+              <w:rPr>
+                <w:rFonts w:ascii="Arial" w:hAnsi="Arial" w:cs="Arial"/>
+              </w:rPr>
+              <w:t>Consolidação dos testes realizados e organização dos arquivos do projeto.</w:t>
+            </w:r>
           </w:p>
         </w:tc>
         <w:tc>
@@ -5582,221 +5091,33 @@
                 <w:rFonts w:ascii="Arial" w:hAnsi="Arial" w:cs="Arial"/>
               </w:rPr>
             </w:pPr>
-          </w:p>
-        </w:tc>
-      </w:tr>
-      <w:tr>
-        <w:trPr>
-          <w:trHeight w:val="99"/>
-        </w:trPr>
-        <w:tc>
-          <w:tcPr>
-            <w:tcW w:w="1816" w:type="dxa"/>
-            <w:vMerge/>
-          </w:tcPr>
-          <w:p>
-            <w:pPr>
-              <w:pStyle w:val="PargrafodaLista"/>
-              <w:spacing w:line="360" w:lineRule="auto"/>
-              <w:ind w:left="0"/>
-              <w:jc w:val="both"/>
-              <w:rPr>
-                <w:rFonts w:ascii="Arial" w:hAnsi="Arial" w:cs="Arial"/>
-              </w:rPr>
-            </w:pPr>
-          </w:p>
-        </w:tc>
-        <w:tc>
-          <w:tcPr>
-            <w:tcW w:w="1722" w:type="dxa"/>
-          </w:tcPr>
-          <w:p>
-            <w:pPr>
-              <w:pStyle w:val="PargrafodaLista"/>
-              <w:spacing w:line="360" w:lineRule="auto"/>
-              <w:ind w:left="0"/>
-              <w:jc w:val="both"/>
-              <w:rPr>
-                <w:rFonts w:ascii="Arial" w:hAnsi="Arial" w:cs="Arial"/>
-              </w:rPr>
-            </w:pPr>
-          </w:p>
-        </w:tc>
-        <w:tc>
-          <w:tcPr>
-            <w:tcW w:w="2758" w:type="dxa"/>
-          </w:tcPr>
-          <w:p>
-            <w:pPr>
-              <w:pStyle w:val="PargrafodaLista"/>
-              <w:spacing w:line="360" w:lineRule="auto"/>
-              <w:ind w:left="0"/>
-              <w:jc w:val="both"/>
-              <w:rPr>
-                <w:rFonts w:ascii="Arial" w:hAnsi="Arial" w:cs="Arial"/>
-              </w:rPr>
-            </w:pPr>
-          </w:p>
-        </w:tc>
-        <w:tc>
-          <w:tcPr>
-            <w:tcW w:w="1772" w:type="dxa"/>
-          </w:tcPr>
-          <w:p>
-            <w:pPr>
-              <w:pStyle w:val="PargrafodaLista"/>
-              <w:spacing w:line="360" w:lineRule="auto"/>
-              <w:ind w:left="0"/>
-              <w:jc w:val="both"/>
-              <w:rPr>
-                <w:rFonts w:ascii="Arial" w:hAnsi="Arial" w:cs="Arial"/>
-              </w:rPr>
-            </w:pPr>
-          </w:p>
-        </w:tc>
-      </w:tr>
-      <w:tr>
-        <w:trPr>
-          <w:trHeight w:val="99"/>
-        </w:trPr>
-        <w:tc>
-          <w:tcPr>
-            <w:tcW w:w="1816" w:type="dxa"/>
-            <w:vMerge/>
-          </w:tcPr>
-          <w:p>
-            <w:pPr>
-              <w:pStyle w:val="PargrafodaLista"/>
-              <w:spacing w:line="360" w:lineRule="auto"/>
-              <w:ind w:left="0"/>
-              <w:jc w:val="both"/>
-              <w:rPr>
-                <w:rFonts w:ascii="Arial" w:hAnsi="Arial" w:cs="Arial"/>
-              </w:rPr>
-            </w:pPr>
-          </w:p>
-        </w:tc>
-        <w:tc>
-          <w:tcPr>
-            <w:tcW w:w="1722" w:type="dxa"/>
-          </w:tcPr>
-          <w:p>
-            <w:pPr>
-              <w:pStyle w:val="PargrafodaLista"/>
-              <w:spacing w:line="360" w:lineRule="auto"/>
-              <w:ind w:left="0"/>
-              <w:jc w:val="both"/>
-              <w:rPr>
-                <w:rFonts w:ascii="Arial" w:hAnsi="Arial" w:cs="Arial"/>
-              </w:rPr>
-            </w:pPr>
-          </w:p>
-        </w:tc>
-        <w:tc>
-          <w:tcPr>
-            <w:tcW w:w="2758" w:type="dxa"/>
-          </w:tcPr>
-          <w:p>
-            <w:pPr>
-              <w:pStyle w:val="PargrafodaLista"/>
-              <w:spacing w:line="360" w:lineRule="auto"/>
-              <w:ind w:left="0"/>
-              <w:jc w:val="both"/>
-              <w:rPr>
-                <w:rFonts w:ascii="Arial" w:hAnsi="Arial" w:cs="Arial"/>
-              </w:rPr>
-            </w:pPr>
-          </w:p>
-        </w:tc>
-        <w:tc>
-          <w:tcPr>
-            <w:tcW w:w="1772" w:type="dxa"/>
-          </w:tcPr>
-          <w:p>
-            <w:pPr>
-              <w:pStyle w:val="PargrafodaLista"/>
-              <w:spacing w:line="360" w:lineRule="auto"/>
-              <w:ind w:left="0"/>
-              <w:jc w:val="both"/>
-              <w:rPr>
-                <w:rFonts w:ascii="Arial" w:hAnsi="Arial" w:cs="Arial"/>
-              </w:rPr>
-            </w:pPr>
-          </w:p>
-        </w:tc>
-      </w:tr>
-      <w:tr>
-        <w:trPr>
-          <w:trHeight w:val="99"/>
-        </w:trPr>
-        <w:tc>
-          <w:tcPr>
-            <w:tcW w:w="1816" w:type="dxa"/>
-          </w:tcPr>
-          <w:p>
-            <w:pPr>
-              <w:pStyle w:val="PargrafodaLista"/>
-              <w:spacing w:line="360" w:lineRule="auto"/>
-              <w:ind w:left="0"/>
-              <w:jc w:val="both"/>
-              <w:rPr>
-                <w:rFonts w:ascii="Arial" w:hAnsi="Arial" w:cs="Arial"/>
-              </w:rPr>
-            </w:pPr>
-          </w:p>
-        </w:tc>
-        <w:tc>
-          <w:tcPr>
-            <w:tcW w:w="1722" w:type="dxa"/>
-          </w:tcPr>
-          <w:p>
-            <w:pPr>
-              <w:pStyle w:val="PargrafodaLista"/>
-              <w:spacing w:line="360" w:lineRule="auto"/>
-              <w:ind w:left="0"/>
-              <w:jc w:val="both"/>
-              <w:rPr>
-                <w:rFonts w:ascii="Arial" w:hAnsi="Arial" w:cs="Arial"/>
-              </w:rPr>
-            </w:pPr>
-          </w:p>
-        </w:tc>
-        <w:tc>
-          <w:tcPr>
-            <w:tcW w:w="2758" w:type="dxa"/>
-          </w:tcPr>
-          <w:p>
-            <w:pPr>
-              <w:pStyle w:val="PargrafodaLista"/>
-              <w:spacing w:line="360" w:lineRule="auto"/>
-              <w:ind w:left="0"/>
-              <w:jc w:val="both"/>
-              <w:rPr>
-                <w:rFonts w:ascii="Arial" w:hAnsi="Arial" w:cs="Arial"/>
-              </w:rPr>
-            </w:pPr>
-          </w:p>
-        </w:tc>
-        <w:tc>
-          <w:tcPr>
-            <w:tcW w:w="1772" w:type="dxa"/>
-          </w:tcPr>
-          <w:p>
-            <w:pPr>
-              <w:pStyle w:val="PargrafodaLista"/>
-              <w:spacing w:line="360" w:lineRule="auto"/>
-              <w:ind w:left="0"/>
-              <w:jc w:val="both"/>
-              <w:rPr>
-                <w:rFonts w:ascii="Arial" w:hAnsi="Arial" w:cs="Arial"/>
-              </w:rPr>
-            </w:pPr>
+            <w:r>
+              <w:rPr>
+                <w:rFonts w:ascii="Arial" w:hAnsi="Arial" w:cs="Arial"/>
+              </w:rPr>
+              <w:t>3h</w:t>
+            </w:r>
           </w:p>
         </w:tc>
       </w:tr>
     </w:tbl>
     <w:p>
       <w:pPr>
+        <w:spacing w:line="360" w:lineRule="auto"/>
+        <w:jc w:val="both"/>
+        <w:rPr>
+          <w:rFonts w:ascii="Arial" w:hAnsi="Arial" w:cs="Arial"/>
+        </w:rPr>
+      </w:pPr>
+      <w:r>
+        <w:rPr>
+          <w:rFonts w:ascii="Arial" w:hAnsi="Arial" w:cs="Arial"/>
+        </w:rPr>
+        <w:t>Cálculo das horas mensais:</w:t>
+      </w:r>
+    </w:p>
+    <w:p>
+      <w:pPr>
         <w:pStyle w:val="PargrafodaLista"/>
         <w:spacing w:line="360" w:lineRule="auto"/>
         <w:ind w:left="426"/>
@@ -5809,7 +5130,25 @@
         <w:rPr>
           <w:rFonts w:ascii="Arial" w:hAnsi="Arial" w:cs="Arial"/>
         </w:rPr>
-        <w:t xml:space="preserve">Cálculo das horas mensais: </w:t>
+        <w:t>Camila:</w:t>
+      </w:r>
+      <w:r>
+        <w:rPr>
+          <w:rFonts w:ascii="Arial" w:hAnsi="Arial" w:cs="Arial"/>
+        </w:rPr>
+        <w:t>7</w:t>
+      </w:r>
+      <w:r>
+        <w:rPr>
+          <w:rFonts w:ascii="Arial" w:hAnsi="Arial" w:cs="Arial"/>
+        </w:rPr>
+        <w:t xml:space="preserve"> horas</w:t>
+      </w:r>
+      <w:r>
+        <w:rPr>
+          <w:rFonts w:ascii="Arial" w:hAnsi="Arial" w:cs="Arial"/>
+        </w:rPr>
+        <w:t xml:space="preserve"> </w:t>
       </w:r>
     </w:p>
     <w:p>
@@ -5826,13 +5165,13 @@
         <w:rPr>
           <w:rFonts w:ascii="Arial" w:hAnsi="Arial" w:cs="Arial"/>
         </w:rPr>
-        <w:t xml:space="preserve">Integrante 1: </w:t>
-      </w:r>
-      <w:r>
-        <w:rPr>
-          <w:rFonts w:ascii="Arial" w:hAnsi="Arial" w:cs="Arial"/>
-        </w:rPr>
-        <w:t>x</w:t>
+        <w:t xml:space="preserve">Daniel: </w:t>
+      </w:r>
+      <w:r>
+        <w:rPr>
+          <w:rFonts w:ascii="Arial" w:hAnsi="Arial" w:cs="Arial"/>
+        </w:rPr>
+        <w:t>7</w:t>
       </w:r>
       <w:r>
         <w:rPr>
@@ -5855,13 +5194,13 @@
         <w:rPr>
           <w:rFonts w:ascii="Arial" w:hAnsi="Arial" w:cs="Arial"/>
         </w:rPr>
-        <w:t xml:space="preserve">Integrante 2: </w:t>
-      </w:r>
-      <w:r>
-        <w:rPr>
-          <w:rFonts w:ascii="Arial" w:hAnsi="Arial" w:cs="Arial"/>
-        </w:rPr>
-        <w:t>x</w:t>
+        <w:t>Diana:</w:t>
+      </w:r>
+      <w:r>
+        <w:rPr>
+          <w:rFonts w:ascii="Arial" w:hAnsi="Arial" w:cs="Arial"/>
+        </w:rPr>
+        <w:t>7</w:t>
       </w:r>
       <w:r>
         <w:rPr>
@@ -5884,19 +5223,19 @@
         <w:rPr>
           <w:rFonts w:ascii="Arial" w:hAnsi="Arial" w:cs="Arial"/>
         </w:rPr>
-        <w:t xml:space="preserve">Integrante 3: </w:t>
-      </w:r>
-      <w:r>
-        <w:rPr>
-          <w:rFonts w:ascii="Arial" w:hAnsi="Arial" w:cs="Arial"/>
-        </w:rPr>
-        <w:t xml:space="preserve">x </w:t>
-      </w:r>
-      <w:r>
-        <w:rPr>
-          <w:rFonts w:ascii="Arial" w:hAnsi="Arial" w:cs="Arial"/>
-        </w:rPr>
-        <w:t>horas</w:t>
+        <w:t>Felipe:</w:t>
+      </w:r>
+      <w:r>
+        <w:rPr>
+          <w:rFonts w:ascii="Arial" w:hAnsi="Arial" w:cs="Arial"/>
+        </w:rPr>
+        <w:t>7</w:t>
+      </w:r>
+      <w:r>
+        <w:rPr>
+          <w:rFonts w:ascii="Arial" w:hAnsi="Arial" w:cs="Arial"/>
+        </w:rPr>
+        <w:t xml:space="preserve"> horas</w:t>
       </w:r>
     </w:p>
     <w:p>
@@ -5913,13 +5252,13 @@
         <w:rPr>
           <w:rFonts w:ascii="Arial" w:hAnsi="Arial" w:cs="Arial"/>
         </w:rPr>
-        <w:t xml:space="preserve">Integrante 4: </w:t>
-      </w:r>
-      <w:r>
-        <w:rPr>
-          <w:rFonts w:ascii="Arial" w:hAnsi="Arial" w:cs="Arial"/>
-        </w:rPr>
-        <w:t>x</w:t>
+        <w:t xml:space="preserve">Francisco: </w:t>
+      </w:r>
+      <w:r>
+        <w:rPr>
+          <w:rFonts w:ascii="Arial" w:hAnsi="Arial" w:cs="Arial"/>
+        </w:rPr>
+        <w:t>7</w:t>
       </w:r>
       <w:r>
         <w:rPr>
@@ -5942,13 +5281,13 @@
         <w:rPr>
           <w:rFonts w:ascii="Arial" w:hAnsi="Arial" w:cs="Arial"/>
         </w:rPr>
-        <w:t xml:space="preserve">Integrante 5: </w:t>
-      </w:r>
-      <w:r>
-        <w:rPr>
-          <w:rFonts w:ascii="Arial" w:hAnsi="Arial" w:cs="Arial"/>
-        </w:rPr>
-        <w:t>x</w:t>
+        <w:t>Luan:</w:t>
+      </w:r>
+      <w:r>
+        <w:rPr>
+          <w:rFonts w:ascii="Arial" w:hAnsi="Arial" w:cs="Arial"/>
+        </w:rPr>
+        <w:t>7</w:t>
       </w:r>
       <w:r>
         <w:rPr>
@@ -5959,36 +5298,60 @@
     </w:p>
     <w:p>
       <w:pPr>
-        <w:spacing w:line="360" w:lineRule="auto"/>
-        <w:jc w:val="both"/>
-        <w:rPr>
-          <w:rFonts w:ascii="Arial" w:hAnsi="Arial" w:cs="Arial"/>
-        </w:rPr>
-      </w:pPr>
-    </w:p>
-    <w:p>
-      <w:pPr>
-        <w:pStyle w:val="PargrafodaLista"/>
-        <w:numPr>
-          <w:ilvl w:val="0"/>
-          <w:numId w:val="1"/>
-        </w:numPr>
+        <w:pStyle w:val="PargrafodaLista"/>
         <w:spacing w:line="360" w:lineRule="auto"/>
         <w:ind w:left="426"/>
         <w:jc w:val="both"/>
         <w:rPr>
           <w:rFonts w:ascii="Arial" w:hAnsi="Arial" w:cs="Arial"/>
-          <w:b/>
-          <w:bCs/>
-        </w:rPr>
-      </w:pPr>
-      <w:r>
-        <w:rPr>
-          <w:rFonts w:ascii="Arial" w:hAnsi="Arial" w:cs="Arial"/>
-          <w:b/>
-          <w:bCs/>
-        </w:rPr>
-        <w:t>Agosto</w:t>
+        </w:rPr>
+      </w:pPr>
+      <w:r>
+        <w:rPr>
+          <w:rFonts w:ascii="Arial" w:hAnsi="Arial" w:cs="Arial"/>
+        </w:rPr>
+        <w:t>Jonatas:</w:t>
+      </w:r>
+      <w:r>
+        <w:rPr>
+          <w:rFonts w:ascii="Arial" w:hAnsi="Arial" w:cs="Arial"/>
+        </w:rPr>
+        <w:t>7</w:t>
+      </w:r>
+      <w:r>
+        <w:rPr>
+          <w:rFonts w:ascii="Arial" w:hAnsi="Arial" w:cs="Arial"/>
+        </w:rPr>
+        <w:t xml:space="preserve"> horas</w:t>
+      </w:r>
+    </w:p>
+    <w:p>
+      <w:pPr>
+        <w:pStyle w:val="PargrafodaLista"/>
+        <w:spacing w:line="360" w:lineRule="auto"/>
+        <w:ind w:left="426"/>
+        <w:jc w:val="both"/>
+        <w:rPr>
+          <w:rFonts w:ascii="Arial" w:hAnsi="Arial" w:cs="Arial"/>
+        </w:rPr>
+      </w:pPr>
+      <w:r>
+        <w:rPr>
+          <w:rFonts w:ascii="Arial" w:hAnsi="Arial" w:cs="Arial"/>
+        </w:rPr>
+        <w:t xml:space="preserve">Miguel: </w:t>
+      </w:r>
+      <w:r>
+        <w:rPr>
+          <w:rFonts w:ascii="Arial" w:hAnsi="Arial" w:cs="Arial"/>
+        </w:rPr>
+        <w:t>7</w:t>
+      </w:r>
+      <w:r>
+        <w:rPr>
+          <w:rFonts w:ascii="Arial" w:hAnsi="Arial" w:cs="Arial"/>
+        </w:rPr>
+        <w:t xml:space="preserve"> horas</w:t>
       </w:r>
     </w:p>
     <w:tbl>
@@ -6130,6 +5493,8 @@
                 <w:rFonts w:ascii="Arial" w:hAnsi="Arial" w:cs="Arial"/>
               </w:rPr>
             </w:pPr>
+            <w:bookmarkStart w:id="0" w:name="_GoBack"/>
+            <w:bookmarkEnd w:id="0"/>
           </w:p>
         </w:tc>
         <w:tc>
@@ -8232,6 +7597,7 @@
         <w:rPr>
           <w:rFonts w:ascii="Arial" w:hAnsi="Arial" w:cs="Arial"/>
         </w:rPr>
+        <w:lastRenderedPageBreak/>
         <w:t xml:space="preserve">Integrante 1: </w:t>
       </w:r>
       <w:r>
@@ -9338,6 +8704,7 @@
         <w:rPr>
           <w:rFonts w:ascii="Arial" w:hAnsi="Arial" w:cs="Arial"/>
         </w:rPr>
+        <w:lastRenderedPageBreak/>
         <w:t>Cada registro semanal evidenc</w:t>
       </w:r>
       <w:r>
@@ -9506,7 +8873,6 @@
         <w:rPr>
           <w:rFonts w:ascii="Arial" w:hAnsi="Arial" w:cs="Arial"/>
         </w:rPr>
-        <w:lastRenderedPageBreak/>
         <w:t xml:space="preserve">Nome: </w:t>
       </w:r>
       <w:r>
@@ -10832,7 +10198,7 @@
   <w:style w:type="paragraph" w:default="1" w:styleId="Normal">
     <w:name w:val="Normal"/>
     <w:qFormat/>
-    <w:rsid w:val="00BF5A13"/>
+    <w:rsid w:val="00D179B1"/>
   </w:style>
   <w:style w:type="paragraph" w:styleId="Ttulo1">
     <w:name w:val="heading 1"/>
@@ -11702,7 +11068,7 @@
 </file>
 
 <file path=customXml/itemProps1.xml><?xml version="1.0" encoding="utf-8"?>
-<ds:datastoreItem xmlns:ds="http://schemas.openxmlformats.org/officeDocument/2006/customXml" ds:itemID="{9899A744-75A5-4B86-9E42-D53754C9BF9B}">
+<ds:datastoreItem xmlns:ds="http://schemas.openxmlformats.org/officeDocument/2006/customXml" ds:itemID="{78DAD98F-D7BB-45A5-8BD2-25C376110F1F}">
   <ds:schemaRefs>
     <ds:schemaRef ds:uri="http://schemas.openxmlformats.org/officeDocument/2006/bibliography"/>
   </ds:schemaRefs>

</xml_diff>